<commit_message>
docs: refresh tech summary with latest code changes
- Updated last-modified date to 2026-03-07
- broker.py: note portfolio history API
- alerts.py: note open orders section in hourly digest
- dashboard: reflect portfolio value/return charts (1D/1W/1M/3M/1Y), open orders table
- Macro context: expand to 14 FRED indicators across 4 categories, 12 rules
- Regenerated TECH_SUMMARY.docx to match

https://claude.ai/code/session_01J9CrmAL84ZYFfsXvWGQpd6
</commit_message>
<xml_diff>
--- a/TECH_SUMMARY.docx
+++ b/TECH_SUMMARY.docx
@@ -30,7 +30,7 @@
         <w:t>Last updated:</w:t>
       </w:r>
       <w:r>
-        <w:t xml:space="preserve"> 2026-03-06 | </w:t>
+        <w:t xml:space="preserve"> 2026-03-07 | </w:t>
       </w:r>
       <w:r>
         <w:rPr>
@@ -40,14 +40,6 @@
       </w:r>
       <w:r>
         <w:t xml:space="preserve"> Phase 4 — Deployed to Fly.io</w:t>
-      </w:r>
-    </w:p>
-    <w:p>
-      <w:pPr>
-        <w:spacing w:after="80"/>
-      </w:pPr>
-      <w:r>
-        <w:t>---</w:t>
       </w:r>
     </w:p>
     <w:p>
@@ -123,14 +115,6 @@
       </w:r>
       <w:r>
         <w:t xml:space="preserve"> every 2 minutes for trailing stops and time-based exits.</w:t>
-      </w:r>
-    </w:p>
-    <w:p>
-      <w:pPr>
-        <w:spacing w:after="80"/>
-      </w:pPr>
-      <w:r>
-        <w:t>---</w:t>
       </w:r>
     </w:p>
     <w:p>
@@ -456,7 +440,7 @@
               <w:rPr>
                 <w:sz w:val="18"/>
               </w:rPr>
-              <w:t>Alpaca paper/live wrapper (account, positions, market orders)</w:t>
+              <w:t>Alpaca paper/live wrapper (account, positions, orders, portfolio history)</w:t>
             </w:r>
           </w:p>
         </w:tc>
@@ -540,7 +524,7 @@
               <w:rPr>
                 <w:sz w:val="18"/>
               </w:rPr>
-              <w:t>Telegram signal alerts and hourly P&amp;L digest (market hours only)</w:t>
+              <w:t>Telegram signal alerts, hourly P&amp;L digest (09:30–16:00 ET), and open orders summary</w:t>
             </w:r>
           </w:p>
         </w:tc>
@@ -596,21 +580,13 @@
               <w:rPr>
                 <w:sz w:val="18"/>
               </w:rPr>
-              <w:t>Streamlit monitoring dashboard</w:t>
+              <w:t>Streamlit dashboard: signals, positions, open orders, portfolio value + return % charts (1D/1W/1M/3M/1Y)</w:t>
             </w:r>
           </w:p>
         </w:tc>
       </w:tr>
     </w:tbl>
     <w:p/>
-    <w:p>
-      <w:pPr>
-        <w:spacing w:after="80"/>
-      </w:pPr>
-      <w:r>
-        <w:t>---</w:t>
-      </w:r>
-    </w:p>
     <w:p>
       <w:pPr>
         <w:pStyle w:val="Heading2"/>
@@ -1252,14 +1228,6 @@
     <w:p/>
     <w:p>
       <w:pPr>
-        <w:spacing w:after="80"/>
-      </w:pPr>
-      <w:r>
-        <w:t>---</w:t>
-      </w:r>
-    </w:p>
-    <w:p>
-      <w:pPr>
         <w:pStyle w:val="Heading2"/>
       </w:pPr>
       <w:r>
@@ -1332,7 +1300,7 @@
         <w:pStyle w:val="ListNumber"/>
       </w:pPr>
       <w:r>
-        <w:t>**Macro context adjustment** — `MacroContext.adjust_signals()` scales confidence up or down based on FRED indicators (fed funds rate, unemployment, yield curve, VIX, credit spreads). Refreshes FRED data every 12 cycles.</w:t>
+        <w:t>**Macro context adjustment** — `MacroContext.adjust_signals()` scales confidence up or down based on 14 FRED indicators across four categories: *Policy* (fed funds rate), *Growth/Labour* (unemployment, jobless claims, consumer sentiment), *Rates/Spreads* (10Y–2Y yield curve, HY credit spreads, 5Y inflation expectations), and *Risk/FX* (VIX, USD index). Twelve rules map these regime readings to confidence boosts or penalties per signal theme. FRED data refreshes every 12 cycles (~1 hr).</w:t>
       </w:r>
     </w:p>
     <w:p>
@@ -1370,14 +1338,6 @@
       </w:pPr>
       <w:r>
         <w:t>`ExitManager.check_exits()` scans open positions and closes any that have hit a trailing stop or exceeded `MAX_HOLD_HOURS` (default 4 hours).</w:t>
-      </w:r>
-    </w:p>
-    <w:p>
-      <w:pPr>
-        <w:spacing w:after="80"/>
-      </w:pPr>
-      <w:r>
-        <w:t>---</w:t>
       </w:r>
     </w:p>
     <w:p>
@@ -1869,14 +1829,6 @@
       </w:pPr>
       <w:r>
         <w:t>The `RiskManager` is stateful: session-start equity is captured at construction and used as the daily loss baseline. It resets on bot restart, which is acceptable for MVP.</w:t>
-      </w:r>
-    </w:p>
-    <w:p>
-      <w:pPr>
-        <w:spacing w:after="80"/>
-      </w:pPr>
-      <w:r>
-        <w:t>---</w:t>
       </w:r>
     </w:p>
     <w:p>
@@ -2413,14 +2365,6 @@
     </w:p>
     <w:p>
       <w:pPr>
-        <w:spacing w:after="80"/>
-      </w:pPr>
-      <w:r>
-        <w:t>---</w:t>
-      </w:r>
-    </w:p>
-    <w:p>
-      <w:pPr>
         <w:pStyle w:val="Heading2"/>
       </w:pPr>
       <w:r>

</xml_diff>